<commit_message>
scripts: inject anchor markers into the SIP template
One-shot reproducible script. Walks the .docx body, finds each
QN · REQUIRED/OPTIONAL heading, locates the next answer table, and
inserts >>> ANSWER QN START >>> / <<< ANSWER QN END <<< paragraphs
inside the first cell. Idempotent — second runs are no-ops. Test
copies the on-disk template to a tmp file and asserts all 17
question pairs are present (and run twice without duplication).

The committed .docx is the result of running this script once
against the original SIP template, so the deterministic SIP parser
has the markers it needs.
</commit_message>
<xml_diff>
--- a/frontend/public/templates/ARTPARK_SIP_Application_Template.docx
+++ b/frontend/public/templates/ARTPARK_SIP_Application_Template.docx
@@ -268,6 +268,11 @@
             <w:shd w:val="clear" w:color="auto" w:fill="FAFAF7"/>
           </w:tcPr>
           <w:p>
+            <w:r>
+              <w:t>&gt;&gt;&gt; ANSWER Q5 START &gt;&gt;&gt;</w:t>
+            </w:r>
+          </w:p>
+          <w:p>
             <w:pPr>
               <w:spacing w:after="80"/>
             </w:pPr>
@@ -292,6 +297,11 @@
                 <w:sz w:val="22"/>
               </w:rPr>
               <w:t xml:space="preserve">   B.  Not yet — we're still pre-incorporation</w:t>
+            </w:r>
+          </w:p>
+          <w:p>
+            <w:r>
+              <w:t>&lt;&lt;&lt; ANSWER Q5 END &lt;&lt;&lt;</w:t>
             </w:r>
           </w:p>
         </w:tc>
@@ -383,6 +393,11 @@
             <w:shd w:val="clear" w:color="auto" w:fill="FAFAF7"/>
           </w:tcPr>
           <w:p>
+            <w:r>
+              <w:t>&gt;&gt;&gt; ANSWER Q6 START &gt;&gt;&gt;</w:t>
+            </w:r>
+          </w:p>
+          <w:p>
             <w:pPr>
               <w:spacing w:after="80"/>
             </w:pPr>
@@ -433,6 +448,11 @@
                 <w:sz w:val="22"/>
               </w:rPr>
               <w:t xml:space="preserve">   D.  TRL 6+ — demonstrated in operational setting</w:t>
+            </w:r>
+          </w:p>
+          <w:p>
+            <w:r>
+              <w:t>&lt;&lt;&lt; ANSWER Q6 END &lt;&lt;&lt;</w:t>
             </w:r>
           </w:p>
         </w:tc>
@@ -524,6 +544,11 @@
             <w:shd w:val="clear" w:color="auto" w:fill="FAFAF7"/>
           </w:tcPr>
           <w:p>
+            <w:r>
+              <w:t>&gt;&gt;&gt; ANSWER Q8 START &gt;&gt;&gt;</w:t>
+            </w:r>
+          </w:p>
+          <w:p>
             <w:pPr>
               <w:spacing w:after="80"/>
             </w:pPr>
@@ -548,6 +573,11 @@
                 <w:sz w:val="22"/>
               </w:rPr>
               <w:t xml:space="preserve">   B.  Yes</w:t>
+            </w:r>
+          </w:p>
+          <w:p>
+            <w:r>
+              <w:t>&lt;&lt;&lt; ANSWER Q8 END &lt;&lt;&lt;</w:t>
             </w:r>
           </w:p>
         </w:tc>
@@ -639,6 +669,11 @@
             <w:shd w:val="clear" w:color="auto" w:fill="FAFAF7"/>
           </w:tcPr>
           <w:p>
+            <w:r>
+              <w:t>&gt;&gt;&gt; ANSWER Q9 START &gt;&gt;&gt;</w:t>
+            </w:r>
+          </w:p>
+          <w:p>
             <w:pPr>
               <w:spacing w:after="40"/>
             </w:pPr>
@@ -663,6 +698,11 @@
             <w:pPr>
               <w:spacing w:after="40"/>
             </w:pPr>
+          </w:p>
+          <w:p>
+            <w:r>
+              <w:t>&lt;&lt;&lt; ANSWER Q9 END &lt;&lt;&lt;</w:t>
+            </w:r>
           </w:p>
         </w:tc>
       </w:tr>
@@ -752,6 +792,11 @@
             <w:tcW w:type="dxa" w:w="8640"/>
             <w:shd w:val="clear" w:color="auto" w:fill="FAFAF7"/>
           </w:tcPr>
+          <w:p>
+            <w:r>
+              <w:t>&gt;&gt;&gt; ANSWER Q10 START &gt;&gt;&gt;</w:t>
+            </w:r>
+          </w:p>
           <w:p>
             <w:pPr>
               <w:spacing w:after="80"/>
@@ -855,6 +900,11 @@
                 <w:sz w:val="22"/>
               </w:rPr>
               <w:t xml:space="preserve">   H.  Other (please specify in the wizard)</w:t>
+            </w:r>
+          </w:p>
+          <w:p>
+            <w:r>
+              <w:t>&lt;&lt;&lt; ANSWER Q10 END &lt;&lt;&lt;</w:t>
             </w:r>
           </w:p>
         </w:tc>
@@ -1039,6 +1089,11 @@
             <w:shd w:val="clear" w:color="auto" w:fill="FAFAF7"/>
           </w:tcPr>
           <w:p>
+            <w:r>
+              <w:t>&gt;&gt;&gt; ANSWER Q11 START &gt;&gt;&gt;</w:t>
+            </w:r>
+          </w:p>
+          <w:p>
             <w:pPr>
               <w:spacing w:after="40"/>
             </w:pPr>
@@ -1078,6 +1133,11 @@
             <w:pPr>
               <w:spacing w:after="40"/>
             </w:pPr>
+          </w:p>
+          <w:p>
+            <w:r>
+              <w:t>&lt;&lt;&lt; ANSWER Q11 END &lt;&lt;&lt;</w:t>
+            </w:r>
           </w:p>
         </w:tc>
       </w:tr>
@@ -1213,6 +1273,11 @@
             <w:shd w:val="clear" w:color="auto" w:fill="FAFAF7"/>
           </w:tcPr>
           <w:p>
+            <w:r>
+              <w:t>&gt;&gt;&gt; ANSWER Q12 START &gt;&gt;&gt;</w:t>
+            </w:r>
+          </w:p>
+          <w:p>
             <w:pPr>
               <w:spacing w:after="40"/>
             </w:pPr>
@@ -1252,6 +1317,11 @@
             <w:pPr>
               <w:spacing w:after="40"/>
             </w:pPr>
+          </w:p>
+          <w:p>
+            <w:r>
+              <w:t>&lt;&lt;&lt; ANSWER Q12 END &lt;&lt;&lt;</w:t>
+            </w:r>
           </w:p>
         </w:tc>
       </w:tr>
@@ -1374,6 +1444,11 @@
             <w:shd w:val="clear" w:color="auto" w:fill="FAFAF7"/>
           </w:tcPr>
           <w:p>
+            <w:r>
+              <w:t>&gt;&gt;&gt; ANSWER Q13 START &gt;&gt;&gt;</w:t>
+            </w:r>
+          </w:p>
+          <w:p>
             <w:pPr>
               <w:spacing w:after="40"/>
             </w:pPr>
@@ -1413,6 +1488,11 @@
             <w:pPr>
               <w:spacing w:after="40"/>
             </w:pPr>
+          </w:p>
+          <w:p>
+            <w:r>
+              <w:t>&lt;&lt;&lt; ANSWER Q13 END &lt;&lt;&lt;</w:t>
+            </w:r>
           </w:p>
         </w:tc>
       </w:tr>
@@ -1503,6 +1583,11 @@
             <w:shd w:val="clear" w:color="auto" w:fill="FAFAF7"/>
           </w:tcPr>
           <w:p>
+            <w:r>
+              <w:t>&gt;&gt;&gt; ANSWER Q14 START &gt;&gt;&gt;</w:t>
+            </w:r>
+          </w:p>
+          <w:p>
             <w:pPr>
               <w:spacing w:after="40"/>
             </w:pPr>
@@ -1532,6 +1617,11 @@
             <w:pPr>
               <w:spacing w:after="40"/>
             </w:pPr>
+          </w:p>
+          <w:p>
+            <w:r>
+              <w:t>&lt;&lt;&lt; ANSWER Q14 END &lt;&lt;&lt;</w:t>
+            </w:r>
           </w:p>
         </w:tc>
       </w:tr>
@@ -1622,6 +1712,11 @@
             <w:shd w:val="clear" w:color="auto" w:fill="FAFAF7"/>
           </w:tcPr>
           <w:p>
+            <w:r>
+              <w:t>&gt;&gt;&gt; ANSWER Q15 START &gt;&gt;&gt;</w:t>
+            </w:r>
+          </w:p>
+          <w:p>
             <w:pPr>
               <w:spacing w:after="80"/>
             </w:pPr>
@@ -1672,6 +1767,11 @@
                 <w:sz w:val="22"/>
               </w:rPr>
               <w:t xml:space="preserve">   D.  Live paying customers — repeat revenue</w:t>
+            </w:r>
+          </w:p>
+          <w:p>
+            <w:r>
+              <w:t>&lt;&lt;&lt; ANSWER Q15 END &lt;&lt;&lt;</w:t>
             </w:r>
           </w:p>
         </w:tc>
@@ -1763,6 +1863,11 @@
             <w:shd w:val="clear" w:color="auto" w:fill="FAFAF7"/>
           </w:tcPr>
           <w:p>
+            <w:r>
+              <w:t>&gt;&gt;&gt; ANSWER Q16 START &gt;&gt;&gt;</w:t>
+            </w:r>
+          </w:p>
+          <w:p>
             <w:pPr>
               <w:spacing w:after="40"/>
             </w:pPr>
@@ -1802,6 +1907,11 @@
             <w:pPr>
               <w:spacing w:after="40"/>
             </w:pPr>
+          </w:p>
+          <w:p>
+            <w:r>
+              <w:t>&lt;&lt;&lt; ANSWER Q16 END &lt;&lt;&lt;</w:t>
+            </w:r>
           </w:p>
         </w:tc>
       </w:tr>
@@ -1937,6 +2047,11 @@
             <w:shd w:val="clear" w:color="auto" w:fill="FAFAF7"/>
           </w:tcPr>
           <w:p>
+            <w:r>
+              <w:t>&gt;&gt;&gt; ANSWER Q17 START &gt;&gt;&gt;</w:t>
+            </w:r>
+          </w:p>
+          <w:p>
             <w:pPr>
               <w:spacing w:after="40"/>
             </w:pPr>
@@ -1976,6 +2091,11 @@
             <w:pPr>
               <w:spacing w:after="40"/>
             </w:pPr>
+          </w:p>
+          <w:p>
+            <w:r>
+              <w:t>&lt;&lt;&lt; ANSWER Q17 END &lt;&lt;&lt;</w:t>
+            </w:r>
           </w:p>
         </w:tc>
       </w:tr>
@@ -2066,6 +2186,11 @@
             <w:shd w:val="clear" w:color="auto" w:fill="FAFAF7"/>
           </w:tcPr>
           <w:p>
+            <w:r>
+              <w:t>&gt;&gt;&gt; ANSWER Q18 START &gt;&gt;&gt;</w:t>
+            </w:r>
+          </w:p>
+          <w:p>
             <w:pPr>
               <w:spacing w:after="40"/>
             </w:pPr>
@@ -2105,6 +2230,11 @@
             <w:pPr>
               <w:spacing w:after="40"/>
             </w:pPr>
+          </w:p>
+          <w:p>
+            <w:r>
+              <w:t>&lt;&lt;&lt; ANSWER Q18 END &lt;&lt;&lt;</w:t>
+            </w:r>
           </w:p>
         </w:tc>
       </w:tr>
@@ -2195,6 +2325,11 @@
             <w:shd w:val="clear" w:color="auto" w:fill="FAFAF7"/>
           </w:tcPr>
           <w:p>
+            <w:r>
+              <w:t>&gt;&gt;&gt; ANSWER Q19 START &gt;&gt;&gt;</w:t>
+            </w:r>
+          </w:p>
+          <w:p>
             <w:pPr>
               <w:spacing w:after="40"/>
             </w:pPr>
@@ -2224,6 +2359,11 @@
             <w:pPr>
               <w:spacing w:after="40"/>
             </w:pPr>
+          </w:p>
+          <w:p>
+            <w:r>
+              <w:t>&lt;&lt;&lt; ANSWER Q19 END &lt;&lt;&lt;</w:t>
+            </w:r>
           </w:p>
         </w:tc>
       </w:tr>
@@ -2314,6 +2454,11 @@
             <w:shd w:val="clear" w:color="auto" w:fill="FAFAF7"/>
           </w:tcPr>
           <w:p>
+            <w:r>
+              <w:t>&gt;&gt;&gt; ANSWER Q20 START &gt;&gt;&gt;</w:t>
+            </w:r>
+          </w:p>
+          <w:p>
             <w:pPr>
               <w:spacing w:after="40"/>
             </w:pPr>
@@ -2343,6 +2488,11 @@
             <w:pPr>
               <w:spacing w:after="40"/>
             </w:pPr>
+          </w:p>
+          <w:p>
+            <w:r>
+              <w:t>&lt;&lt;&lt; ANSWER Q20 END &lt;&lt;&lt;</w:t>
+            </w:r>
           </w:p>
         </w:tc>
       </w:tr>
@@ -2433,6 +2583,11 @@
             <w:shd w:val="clear" w:color="auto" w:fill="FAFAF7"/>
           </w:tcPr>
           <w:p>
+            <w:r>
+              <w:t>&gt;&gt;&gt; ANSWER Q21 START &gt;&gt;&gt;</w:t>
+            </w:r>
+          </w:p>
+          <w:p>
             <w:pPr>
               <w:spacing w:after="40"/>
             </w:pPr>
@@ -2462,6 +2617,11 @@
             <w:pPr>
               <w:spacing w:after="40"/>
             </w:pPr>
+          </w:p>
+          <w:p>
+            <w:r>
+              <w:t>&lt;&lt;&lt; ANSWER Q21 END &lt;&lt;&lt;</w:t>
+            </w:r>
           </w:p>
         </w:tc>
       </w:tr>
@@ -2597,6 +2757,11 @@
             <w:shd w:val="clear" w:color="auto" w:fill="FAFAF7"/>
           </w:tcPr>
           <w:p>
+            <w:r>
+              <w:t>&gt;&gt;&gt; ANSWER Q24 START &gt;&gt;&gt;</w:t>
+            </w:r>
+          </w:p>
+          <w:p>
             <w:pPr>
               <w:spacing w:after="40"/>
             </w:pPr>
@@ -2606,6 +2771,11 @@
             <w:pPr>
               <w:spacing w:after="40"/>
             </w:pPr>
+          </w:p>
+          <w:p>
+            <w:r>
+              <w:t>&lt;&lt;&lt; ANSWER Q24 END &lt;&lt;&lt;</w:t>
+            </w:r>
           </w:p>
         </w:tc>
       </w:tr>

</xml_diff>